<commit_message>
AGI 0731328-27: complementa voto com autos de origem (decisão agravada, emolumentos, tempestividade)
Co-Authored-By: Claude Sonnet 5.5 <noreply@anthropic.com>
Claude-Session: https://claude.ai/code/session_01TWDXExLUcLi7Ee9hur8Tss
</commit_message>
<xml_diff>
--- a/entregas-0731328-zero/10 AGI 0731328-27 Marcos DP pesquisa patrimonial SERP-JUD cumprimento de sentença (voto do zero).docx
+++ b/entregas-0731328-zero/10 AGI 0731328-27 Marcos DP pesquisa patrimonial SERP-JUD cumprimento de sentença (voto do zero).docx
@@ -1070,7 +1070,7 @@
           <w:i w:val="0"/>
           <w:sz w:val="28"/>
         </w:rPr>
-        <w:t>2. A decisão agravada indeferiu o pedido de pesquisa patrimonial por meio do sistema SERP-JUD, ao fundamento de que a medida atenderia interesse exclusivo do credor, que poderia realizá-la diretamente junto às serventias, às suas expensas.</w:t>
+        <w:t>2. A decisão agravada indeferiu a pesquisa de bens imóveis do executado por meio do sistema SERP-JUD, ao fundamento de que a medida atenderia interesse exclusivo do credor, com a utilização de recursos humanos do Poder Judiciário, e de que cabe ao exequente, que não figura como hipossuficiente, promovê-la junto às serventias, às suas expensas e com seus próprios recursos.</w:t>
       </w:r>
     </w:p>
     <w:p>
@@ -1175,7 +1175,22 @@
           <w:i w:val="0"/>
           <w:sz w:val="28"/>
         </w:rPr>
-        <w:t>7. No caso, o indeferimento da pesquisa ao fundamento de que o credor poderia realizá-la diretamente, às suas expensas, deve ser reformado.</w:t>
+        <w:t>7. A ausência de hipossuficiência do exequente e a incidência de emolumentos não impedem a pesquisa pelo SERP-JUD, pois o custo pode ser exigido da parte no momento oportuno.</w:t>
+      </w:r>
+    </w:p>
+    <w:p>
+      <w:pPr>
+        <w:spacing w:line="360" w:lineRule="auto" w:after="0" w:before="0"/>
+        <w:jc w:val="both"/>
+      </w:pPr>
+      <w:r>
+        <w:rPr>
+          <w:rFonts w:ascii="Arial" w:hAnsi="Arial" w:cs="Arial"/>
+          <w:b w:val="0"/>
+          <w:i w:val="0"/>
+          <w:sz w:val="28"/>
+        </w:rPr>
+        <w:t>8. No caso, o indeferimento da pesquisa ao fundamento de que o credor poderia realizá-la diretamente, às suas expensas, deve ser reformado.</w:t>
       </w:r>
     </w:p>
     <w:p>
@@ -1205,7 +1220,7 @@
           <w:i w:val="0"/>
           <w:sz w:val="28"/>
         </w:rPr>
-        <w:t>8. Deu-se provimento ao agravo de instrumento do exequente para, confirmando a liminar, determinar a pesquisa de bens do executado no sistema SERP-JUD.</w:t>
+        <w:t>9. Deu-se provimento ao agravo de instrumento do exequente para, confirmando a liminar, determinar a pesquisa de bens do executado no sistema SERP-JUD.</w:t>
       </w:r>
     </w:p>
     <w:p>
@@ -1245,7 +1260,7 @@
           <w:i w:val="0"/>
           <w:sz w:val="26"/>
         </w:rPr>
-        <w:t xml:space="preserve"> STJ, REsp nº 2.226.101/SC, Quarta Turma, j. 07/04/2026; TJDFT, Acórdão 1983548, Processo nº 0751677-22.2024.8.07.0000, Rel. Des. Mauricio Silva Miranda, 7ª Turma Cível, j. 26/03/2025, DJe 08/04/2025; TJDFT, Acórdão 2125505, Processo nº 0708227-58.2026.8.07.0000, Rel. Des. Carlos Pires Soares Neto, 1ª Turma Cível, j. 13/05/2026, DJe 28/05/2026.</w:t>
+        <w:t xml:space="preserve"> STJ, REsp nº 2.226.101/SC, Quarta Turma, j. 07/04/2026; TJDFT, Processo nº 0744294-56.2025.8.07.0000, Rel. Des. Aiston Henrique de Sousa, 4ª Turma Cível, j. 22/01/2026; TJDFT, Acórdão 1983548, Processo nº 0751677-22.2024.8.07.0000, Rel. Des. Mauricio Silva Miranda, 7ª Turma Cível, j. 26/03/2025, DJe 08/04/2025; TJDFT, Acórdão 2125505, Processo nº 0708227-58.2026.8.07.0000, Rel. Des. Carlos Pires Soares Neto, 1ª Turma Cível, j. 13/05/2026, DJe 28/05/2026.</w:t>
       </w:r>
     </w:p>
     <w:p>
@@ -1327,7 +1342,7 @@
           <w:color w:val="EE0000"/>
           <w:sz w:val="28"/>
         </w:rPr>
-        <w:t>Finalidade da medida</w:t>
+        <w:t>Natureza do SERP-JUD</w:t>
       </w:r>
     </w:p>
     <w:p>
@@ -1343,7 +1358,7 @@
           <w:color w:val="EE0000"/>
           <w:sz w:val="28"/>
         </w:rPr>
-        <w:t>1. O juízo consignou que a pesquisa patrimonial por meio do sistema SERP-JUD atenderia interesse exclusivo do credor.</w:t>
+        <w:t>1. O juízo consignou que o SERP-JUD é módulo do Serp destinado ao Poder Judiciário e aos órgãos da Administração Pública, e que a pesquisa de imóveis atenderia interesse exclusivo do credor, com a utilização de recursos humanos do Judiciário.</w:t>
       </w:r>
     </w:p>
     <w:p>
@@ -1360,7 +1375,7 @@
           <w:color w:val="EE0000"/>
           <w:sz w:val="28"/>
         </w:rPr>
-        <w:t>Diligência pelo próprio credor</w:t>
+        <w:t>Ônus do credor</w:t>
       </w:r>
     </w:p>
     <w:p>
@@ -1376,7 +1391,7 @@
           <w:color w:val="EE0000"/>
           <w:sz w:val="28"/>
         </w:rPr>
-        <w:t>2. O juízo registrou que o credor pode realizar a pesquisa diretamente junto às serventias, às suas expensas.</w:t>
+        <w:t>2. O juízo registrou que o exequente, que não figura como hipossuficiente, deve promover a pesquisa junto às serventias de registros públicos, às suas expensas e com seus próprios recursos, sem dispensa dos emolumentos.</w:t>
       </w:r>
     </w:p>
     <w:p>
@@ -1409,7 +1424,23 @@
           <w:color w:val="EE0000"/>
           <w:sz w:val="28"/>
         </w:rPr>
-        <w:t>3. Foi indeferido o pedido de pesquisa patrimonial por meio do sistema SERP-JUD.</w:t>
+        <w:t>3. Foi indeferido o pedido de pesquisa de bens imóveis do executado por meio do SERP-JUD.</w:t>
+      </w:r>
+    </w:p>
+    <w:p>
+      <w:pPr>
+        <w:spacing w:line="360" w:lineRule="auto" w:after="0" w:before="0"/>
+        <w:jc w:val="both"/>
+      </w:pPr>
+      <w:r>
+        <w:rPr>
+          <w:rFonts w:ascii="Arial" w:hAnsi="Arial" w:cs="Arial"/>
+          <w:b w:val="0"/>
+          <w:i w:val="0"/>
+          <w:color w:val="EE0000"/>
+          <w:sz w:val="28"/>
+        </w:rPr>
+        <w:t>4. Foi determinado o retorno do processo ao arquivo provisório, até 01/06/2031.</w:t>
       </w:r>
     </w:p>
     <w:p>
@@ -1698,6 +1729,33 @@
           <w:i w:val="0"/>
           <w:sz w:val="28"/>
         </w:rPr>
+        <w:t>O Juízo de origem determinou a pesquisa no SERP-JUD e, realizada a consulta em 28/08/2026, intimou o exequente a se manifestar (ID 288777231, do processo de origem).</w:t>
+      </w:r>
+    </w:p>
+    <w:p>
+      <w:pPr>
+        <w:spacing w:line="360" w:lineRule="auto" w:after="0"/>
+        <w:ind w:firstLine="2268"/>
+      </w:pPr>
+      <w:r>
+        <w:rPr>
+          <w:sz w:val="28"/>
+        </w:rPr>
+      </w:r>
+    </w:p>
+    <w:p>
+      <w:pPr>
+        <w:spacing w:line="360" w:lineRule="auto" w:after="0" w:before="0"/>
+        <w:ind w:firstLine="2268"/>
+        <w:jc w:val="both"/>
+      </w:pPr>
+      <w:r>
+        <w:rPr>
+          <w:rFonts w:ascii="Arial" w:hAnsi="Arial" w:cs="Arial"/>
+          <w:b w:val="0"/>
+          <w:i w:val="0"/>
+          <w:sz w:val="28"/>
+        </w:rPr>
         <w:t>Sem contrarrazões (ID 88052449).</w:t>
       </w:r>
     </w:p>
@@ -2349,15 +2407,22 @@
         <w:ind w:firstLine="2268"/>
         <w:jc w:val="both"/>
       </w:pPr>
-      <w:r>
-        <w:rPr>
-          <w:rFonts w:ascii="Arial" w:hAnsi="Arial" w:cs="Arial"/>
-          <w:b w:val="0"/>
-          <w:i w:val="0"/>
-          <w:sz w:val="28"/>
-          <w:highlight w:val="yellow"/>
-        </w:rPr>
-        <w:t>Assim, a possibilidade de o credor realizar a diligência diretamente junto às serventias, às suas expensas, não afasta a pesquisa pelo SERP-JUD, determinada por ordem judicial fundamentada.</w:t>
+      <w:commentRangeStart w:id="6"/>
+      <w:r>
+        <w:rPr>
+          <w:rFonts w:ascii="Arial" w:hAnsi="Arial" w:cs="Arial"/>
+          <w:b w:val="0"/>
+          <w:i w:val="0"/>
+          <w:sz w:val="28"/>
+        </w:rPr>
+        <w:t>Por outro lado, a ausência de hipossuficiência do exequente e a incidência de emolumentos não impedem a pesquisa pelo SERP-JUD, pois o custo pode ser exigido da parte no momento oportuno. Nesse sentido:</w:t>
+      </w:r>
+      <w:commentRangeEnd w:id="6"/>
+      <w:r>
+        <w:rPr>
+          <w:rStyle w:val="CommentReference"/>
+        </w:rPr>
+        <w:commentReference w:id="6"/>
       </w:r>
     </w:p>
     <w:p>
@@ -2374,44 +2439,17 @@
     <w:p>
       <w:pPr>
         <w:spacing w:line="360" w:lineRule="auto" w:after="0" w:before="0"/>
-        <w:ind w:firstLine="2268"/>
-        <w:jc w:val="both"/>
-      </w:pPr>
-      <w:commentRangeStart w:id="6"/>
-      <w:r>
-        <w:rPr>
-          <w:rFonts w:ascii="Arial" w:hAnsi="Arial" w:cs="Arial"/>
-          <w:b w:val="0"/>
-          <w:i w:val="0"/>
-          <w:sz w:val="28"/>
-        </w:rPr>
-        <w:t xml:space="preserve">Dito isso, e não havendo alteração do quadro fático-jurídico delineado nos autos, com a máxima vênia ao d. Juízo de origem, </w:t>
-      </w:r>
-      <w:r>
-        <w:rPr>
-          <w:rFonts w:ascii="Arial" w:hAnsi="Arial" w:cs="Arial"/>
-          <w:b w:val="0"/>
-          <w:i w:val="0"/>
-          <w:sz w:val="28"/>
-          <w:highlight w:val="yellow"/>
-        </w:rPr>
-        <w:t>deve ser reformada a r. decisão agravada para determinar a pesquisa de bens do executado no sistema SERP-JUD</w:t>
-      </w:r>
-      <w:r>
-        <w:rPr>
-          <w:rFonts w:ascii="Arial" w:hAnsi="Arial" w:cs="Arial"/>
-          <w:b w:val="0"/>
-          <w:i w:val="0"/>
-          <w:sz w:val="28"/>
-        </w:rPr>
-        <w:t>.</w:t>
-      </w:r>
-      <w:commentRangeEnd w:id="6"/>
-      <w:r>
-        <w:rPr>
-          <w:rStyle w:val="CommentReference"/>
-        </w:rPr>
-        <w:commentReference w:id="6"/>
+        <w:ind w:left="2268"/>
+        <w:jc w:val="both"/>
+      </w:pPr>
+      <w:r>
+        <w:rPr>
+          <w:rFonts w:ascii="Arial" w:hAnsi="Arial" w:cs="Arial"/>
+          <w:b w:val="0"/>
+          <w:i/>
+          <w:sz w:val="26"/>
+        </w:rPr>
+        <w:t>“A existência de eventual custo decorrente dos emolumentos cartorários não constitui impedimento ao deferimento da medida judicialmente requerida, podendo seu recolhimento ser exigido da parte autora no momento oportuno.” (Processo 0744294-56.2025.8.07.0000, Relator(a): AISTON HENRIQUE DE SOUSA, 4ª TURMA CÍVEL, data de julgamento: 22/01/2026.) – Grifei</w:t>
       </w:r>
     </w:p>
     <w:p>
@@ -2427,18 +2465,19 @@
     </w:p>
     <w:p>
       <w:pPr>
-        <w:keepNext/>
-        <w:spacing w:line="360" w:lineRule="auto" w:after="0" w:before="0"/>
-        <w:jc w:val="center"/>
-      </w:pPr>
-      <w:r>
-        <w:rPr>
-          <w:rFonts w:ascii="Arial" w:hAnsi="Arial" w:cs="Arial"/>
-          <w:b/>
-          <w:i w:val="0"/>
-          <w:sz w:val="28"/>
-        </w:rPr>
-        <w:t>DISPOSITIVO</w:t>
+        <w:spacing w:line="360" w:lineRule="auto" w:after="0" w:before="0"/>
+        <w:ind w:firstLine="2268"/>
+        <w:jc w:val="both"/>
+      </w:pPr>
+      <w:r>
+        <w:rPr>
+          <w:rFonts w:ascii="Arial" w:hAnsi="Arial" w:cs="Arial"/>
+          <w:b w:val="0"/>
+          <w:i w:val="0"/>
+          <w:sz w:val="28"/>
+          <w:highlight w:val="yellow"/>
+        </w:rPr>
+        <w:t>Assim, a possibilidade de o credor realizar a diligência diretamente junto às serventias, às suas expensas, e a ausência de hipossuficiência não afastam a pesquisa pelo SERP-JUD, determinada por ordem judicial fundamentada.</w:t>
       </w:r>
     </w:p>
     <w:p>
@@ -2466,25 +2505,26 @@
           <w:i w:val="0"/>
           <w:sz w:val="28"/>
         </w:rPr>
-        <w:t xml:space="preserve">Ante o exposto, reiteradas as vênias, </w:t>
-      </w:r>
-      <w:r>
-        <w:rPr>
-          <w:rFonts w:ascii="Arial" w:hAnsi="Arial" w:cs="Arial"/>
-          <w:b/>
-          <w:i w:val="0"/>
-          <w:sz w:val="28"/>
-        </w:rPr>
-        <w:t>dou provimento</w:t>
-      </w:r>
-      <w:r>
-        <w:rPr>
-          <w:rFonts w:ascii="Arial" w:hAnsi="Arial" w:cs="Arial"/>
-          <w:b w:val="0"/>
-          <w:i w:val="0"/>
-          <w:sz w:val="28"/>
-        </w:rPr>
-        <w:t xml:space="preserve"> ao agravo de instrumento do exequente, Marcello Henrique Rodrigues Silva, para, confirmando a liminar, determinar a pesquisa de bens do executado no sistema SERP-JUD.</w:t>
+        <w:t xml:space="preserve">Dito isso, e não havendo alteração do quadro fático-jurídico delineado nos autos, com a máxima vênia ao d. Juízo de origem, </w:t>
+      </w:r>
+      <w:r>
+        <w:rPr>
+          <w:rFonts w:ascii="Arial" w:hAnsi="Arial" w:cs="Arial"/>
+          <w:b w:val="0"/>
+          <w:i w:val="0"/>
+          <w:sz w:val="28"/>
+          <w:highlight w:val="yellow"/>
+        </w:rPr>
+        <w:t>deve ser reformada a r. decisão agravada para determinar a pesquisa de bens do executado no sistema SERP-JUD</w:t>
+      </w:r>
+      <w:r>
+        <w:rPr>
+          <w:rFonts w:ascii="Arial" w:hAnsi="Arial" w:cs="Arial"/>
+          <w:b w:val="0"/>
+          <w:i w:val="0"/>
+          <w:sz w:val="28"/>
+        </w:rPr>
+        <w:t>.</w:t>
       </w:r>
       <w:commentRangeEnd w:id="7"/>
       <w:r>
@@ -2507,18 +2547,18 @@
     </w:p>
     <w:p>
       <w:pPr>
-        <w:spacing w:line="360" w:lineRule="auto" w:after="0" w:before="0"/>
-        <w:ind w:firstLine="2268"/>
-        <w:jc w:val="both"/>
-      </w:pPr>
-      <w:r>
-        <w:rPr>
-          <w:rFonts w:ascii="Arial" w:hAnsi="Arial" w:cs="Arial"/>
-          <w:b w:val="0"/>
-          <w:i w:val="0"/>
-          <w:sz w:val="28"/>
-        </w:rPr>
-        <w:t>É como voto.</w:t>
+        <w:keepNext/>
+        <w:spacing w:line="360" w:lineRule="auto" w:after="0" w:before="0"/>
+        <w:jc w:val="center"/>
+      </w:pPr>
+      <w:r>
+        <w:rPr>
+          <w:rFonts w:ascii="Arial" w:hAnsi="Arial" w:cs="Arial"/>
+          <w:b/>
+          <w:i w:val="0"/>
+          <w:sz w:val="28"/>
+        </w:rPr>
+        <w:t>DISPOSITIVO</w:t>
       </w:r>
     </w:p>
     <w:p>
@@ -2535,9 +2575,89 @@
     <w:p>
       <w:pPr>
         <w:spacing w:line="360" w:lineRule="auto" w:after="0" w:before="0"/>
+        <w:ind w:firstLine="2268"/>
+        <w:jc w:val="both"/>
+      </w:pPr>
+      <w:commentRangeStart w:id="8"/>
+      <w:r>
+        <w:rPr>
+          <w:rFonts w:ascii="Arial" w:hAnsi="Arial" w:cs="Arial"/>
+          <w:b w:val="0"/>
+          <w:i w:val="0"/>
+          <w:sz w:val="28"/>
+        </w:rPr>
+        <w:t xml:space="preserve">Ante o exposto, reiteradas as vênias, </w:t>
+      </w:r>
+      <w:r>
+        <w:rPr>
+          <w:rFonts w:ascii="Arial" w:hAnsi="Arial" w:cs="Arial"/>
+          <w:b/>
+          <w:i w:val="0"/>
+          <w:sz w:val="28"/>
+        </w:rPr>
+        <w:t>dou provimento</w:t>
+      </w:r>
+      <w:r>
+        <w:rPr>
+          <w:rFonts w:ascii="Arial" w:hAnsi="Arial" w:cs="Arial"/>
+          <w:b w:val="0"/>
+          <w:i w:val="0"/>
+          <w:sz w:val="28"/>
+        </w:rPr>
+        <w:t xml:space="preserve"> ao agravo de instrumento do exequente, Marcello Henrique Rodrigues Silva, para, confirmando a liminar, determinar a pesquisa de bens do executado no sistema SERP-JUD.</w:t>
+      </w:r>
+      <w:commentRangeEnd w:id="8"/>
+      <w:r>
+        <w:rPr>
+          <w:rStyle w:val="CommentReference"/>
+        </w:rPr>
+        <w:commentReference w:id="8"/>
+      </w:r>
+    </w:p>
+    <w:p>
+      <w:pPr>
+        <w:spacing w:line="360" w:lineRule="auto" w:after="0"/>
+        <w:ind w:firstLine="2268"/>
+      </w:pPr>
+      <w:r>
+        <w:rPr>
+          <w:sz w:val="28"/>
+        </w:rPr>
+      </w:r>
+    </w:p>
+    <w:p>
+      <w:pPr>
+        <w:spacing w:line="360" w:lineRule="auto" w:after="0" w:before="0"/>
+        <w:ind w:firstLine="2268"/>
+        <w:jc w:val="both"/>
+      </w:pPr>
+      <w:r>
+        <w:rPr>
+          <w:rFonts w:ascii="Arial" w:hAnsi="Arial" w:cs="Arial"/>
+          <w:b w:val="0"/>
+          <w:i w:val="0"/>
+          <w:sz w:val="28"/>
+        </w:rPr>
+        <w:t>É como voto.</w:t>
+      </w:r>
+    </w:p>
+    <w:p>
+      <w:pPr>
+        <w:spacing w:line="360" w:lineRule="auto" w:after="0"/>
+        <w:ind w:firstLine="2268"/>
+      </w:pPr>
+      <w:r>
+        <w:rPr>
+          <w:sz w:val="28"/>
+        </w:rPr>
+      </w:r>
+    </w:p>
+    <w:p>
+      <w:pPr>
+        <w:spacing w:line="360" w:lineRule="auto" w:after="0" w:before="0"/>
         <w:jc w:val="center"/>
       </w:pPr>
-      <w:commentRangeStart w:id="8"/>
+      <w:commentRangeStart w:id="9"/>
       <w:r>
         <w:rPr>
           <w:rFonts w:ascii="Arial" w:hAnsi="Arial" w:cs="Arial"/>
@@ -2546,14 +2666,14 @@
           <w:color w:val="00B050"/>
           <w:sz w:val="22"/>
         </w:rPr>
-        <w:t>DECISÃO AGRAVADA (ID 278321327, do processo de origem)</w:t>
-      </w:r>
-      <w:commentRangeEnd w:id="8"/>
+        <w:t>DECISÃO INTERLOCUTÓRIA (ID 278321327)</w:t>
+      </w:r>
+      <w:commentRangeEnd w:id="9"/>
       <w:r>
         <w:rPr>
           <w:rStyle w:val="CommentReference"/>
         </w:rPr>
-        <w:commentReference w:id="8"/>
+        <w:commentReference w:id="9"/>
       </w:r>
     </w:p>
     <w:p>
@@ -2580,7 +2700,7 @@
           <w:color w:val="00B050"/>
           <w:sz w:val="22"/>
         </w:rPr>
-        <w:t>[Pendente: texto integral da decisão agravada, que não consta dos autos recebidos.]</w:t>
+        <w:t>Formulou a parte exequente pedido voltado à realização de pesquisa ao SERP-JUD, com vistas à localização de bens imóveis do executado.</w:t>
       </w:r>
     </w:p>
     <w:p>
@@ -2596,11 +2716,308 @@
     </w:p>
     <w:p>
       <w:pPr>
+        <w:spacing w:line="360" w:lineRule="auto" w:after="0" w:before="0"/>
+        <w:jc w:val="both"/>
+      </w:pPr>
+      <w:r>
+        <w:rPr>
+          <w:rFonts w:ascii="Arial" w:hAnsi="Arial" w:cs="Arial"/>
+          <w:b w:val="0"/>
+          <w:i w:val="0"/>
+          <w:color w:val="00B050"/>
+          <w:sz w:val="22"/>
+        </w:rPr>
+        <w:t>O Sistema Eletrônico dos Registros Públicos (Serp), estatuído pela Lei nº 14.382/2022, cujo escopo consistiu em modernizar e simplificar os procedimentos relativos aos registros públicos de atos e negócios jurídicos, de que trata a Lei n. 6.015/73 (Lei de Registros Públicos), e de incorporações imobiliárias, de que trata a Lei nº 4.591/64, compreende uma plataforma digital que conecta todas as serventias de registros públicos e suas informações numa única rede, configurando, desse modo, um sistema de registro unificado.</w:t>
+      </w:r>
+    </w:p>
+    <w:p>
+      <w:pPr>
+        <w:spacing w:line="360" w:lineRule="auto" w:after="0"/>
+        <w:ind w:firstLine="2268"/>
+      </w:pPr>
+      <w:r>
+        <w:rPr>
+          <w:sz w:val="28"/>
+        </w:rPr>
+      </w:r>
+    </w:p>
+    <w:p>
+      <w:pPr>
+        <w:spacing w:line="360" w:lineRule="auto" w:after="0" w:before="0"/>
+        <w:jc w:val="both"/>
+      </w:pPr>
+      <w:r>
+        <w:rPr>
+          <w:rFonts w:ascii="Arial" w:hAnsi="Arial" w:cs="Arial"/>
+          <w:b w:val="0"/>
+          <w:i w:val="0"/>
+          <w:color w:val="00B050"/>
+          <w:sz w:val="22"/>
+        </w:rPr>
+        <w:t>Tal plataforma exigiu para a sua implantação, manutenção e funcionamento, a constituição de um Operador Nacional (ONSERP), o qual, consoante o disposto no art. 213, do Provimento nº 149/2023, da Corregedoria do Conselho Nacional de Justiça, deveria ser integrado pelo Operador Nacional do Registro Eletrônico de Imóveis, já existente, bem como pelos operadores dos demais registros, a serem criados (ON-RCPN e ON-RTDPJ).</w:t>
+      </w:r>
+    </w:p>
+    <w:p>
+      <w:pPr>
+        <w:spacing w:line="360" w:lineRule="auto" w:after="0"/>
+        <w:ind w:firstLine="2268"/>
+      </w:pPr>
+      <w:r>
+        <w:rPr>
+          <w:sz w:val="28"/>
+        </w:rPr>
+      </w:r>
+    </w:p>
+    <w:p>
+      <w:pPr>
+        <w:spacing w:line="360" w:lineRule="auto" w:after="0" w:before="0"/>
+        <w:jc w:val="both"/>
+      </w:pPr>
+      <w:r>
+        <w:rPr>
+          <w:rFonts w:ascii="Arial" w:hAnsi="Arial" w:cs="Arial"/>
+          <w:b w:val="0"/>
+          <w:i w:val="0"/>
+          <w:color w:val="00B050"/>
+          <w:sz w:val="22"/>
+        </w:rPr>
+        <w:t>Trata-se, portanto, de uma ferramenta que pretende, por meio da interconexão entre as serventias e da interoperabilidade entre seu banco de dados, fornecer, através dos sistemas já desenvolvidos pelos registradores públicos (CRC, SAEC, PENHORA ONLINE, CNIB, CENTRAL RTDPJ), uma informação única, proporcionando, assim, comodidade, agilidade, transparência, sem, contudo, dispensar o recolhimento dos emolumentos necessários.</w:t>
+      </w:r>
+    </w:p>
+    <w:p>
+      <w:pPr>
+        <w:spacing w:line="360" w:lineRule="auto" w:after="0"/>
+        <w:ind w:firstLine="2268"/>
+      </w:pPr>
+      <w:r>
+        <w:rPr>
+          <w:sz w:val="28"/>
+        </w:rPr>
+      </w:r>
+    </w:p>
+    <w:p>
+      <w:pPr>
+        <w:spacing w:line="360" w:lineRule="auto" w:after="0" w:before="0"/>
+        <w:jc w:val="both"/>
+      </w:pPr>
+      <w:r>
+        <w:rPr>
+          <w:rFonts w:ascii="Arial" w:hAnsi="Arial" w:cs="Arial"/>
+          <w:b w:val="0"/>
+          <w:i w:val="0"/>
+          <w:color w:val="00B050"/>
+          <w:sz w:val="22"/>
+        </w:rPr>
+        <w:t>O Serp-Jud, a seu turno, corresponde ao primeiro módulo do Serp, cuja utilização destina-se ao Poder Judiciário e aos órgãos da Administração Pública.</w:t>
+      </w:r>
+    </w:p>
+    <w:p>
+      <w:pPr>
+        <w:spacing w:line="360" w:lineRule="auto" w:after="0"/>
+        <w:ind w:firstLine="2268"/>
+      </w:pPr>
+      <w:r>
+        <w:rPr>
+          <w:sz w:val="28"/>
+        </w:rPr>
+      </w:r>
+    </w:p>
+    <w:p>
+      <w:pPr>
+        <w:spacing w:line="360" w:lineRule="auto" w:after="0" w:before="0"/>
+        <w:jc w:val="both"/>
+      </w:pPr>
+      <w:r>
+        <w:rPr>
+          <w:rFonts w:ascii="Arial" w:hAnsi="Arial" w:cs="Arial"/>
+          <w:b w:val="0"/>
+          <w:i w:val="0"/>
+          <w:color w:val="00B050"/>
+          <w:sz w:val="22"/>
+        </w:rPr>
+        <w:t>Prestado o devido esclarecimento, INDEFIRO o pedido voltado à pesquisa, no interesse exclusivo da parte credora e com a utilização de recursos humanos do Poder Judiciário, de bens imóveis do devedor, por meio da supracitada plataforma, porquanto cabe à referida parte, que não figura como hipossuficiente na presente demanda, promover a pesquisa junto às serventias de registros públicos, às suas expensas e com seus próprios recursos.</w:t>
+      </w:r>
+    </w:p>
+    <w:p>
+      <w:pPr>
+        <w:spacing w:line="360" w:lineRule="auto" w:after="0"/>
+        <w:ind w:firstLine="2268"/>
+      </w:pPr>
+      <w:r>
+        <w:rPr>
+          <w:sz w:val="28"/>
+        </w:rPr>
+      </w:r>
+    </w:p>
+    <w:p>
+      <w:pPr>
+        <w:spacing w:line="360" w:lineRule="auto" w:after="0" w:before="0"/>
+        <w:jc w:val="both"/>
+      </w:pPr>
+      <w:r>
+        <w:rPr>
+          <w:rFonts w:ascii="Arial" w:hAnsi="Arial" w:cs="Arial"/>
+          <w:b w:val="0"/>
+          <w:i w:val="0"/>
+          <w:color w:val="00B050"/>
+          <w:sz w:val="22"/>
+        </w:rPr>
+        <w:t>A sentença anexada em ID 269424769 possui erro material. Sua cópia deve ser trasladada para os autos do cumprimento de sentença de n. 0727195-41.2023, e não para o presente.</w:t>
+      </w:r>
+    </w:p>
+    <w:p>
+      <w:pPr>
+        <w:spacing w:line="360" w:lineRule="auto" w:after="0"/>
+        <w:ind w:firstLine="2268"/>
+      </w:pPr>
+      <w:r>
+        <w:rPr>
+          <w:sz w:val="28"/>
+        </w:rPr>
+      </w:r>
+    </w:p>
+    <w:p>
+      <w:pPr>
+        <w:spacing w:line="360" w:lineRule="auto" w:after="0" w:before="0"/>
+        <w:jc w:val="both"/>
+      </w:pPr>
+      <w:r>
+        <w:rPr>
+          <w:rFonts w:ascii="Arial" w:hAnsi="Arial" w:cs="Arial"/>
+          <w:b w:val="0"/>
+          <w:i w:val="0"/>
+          <w:color w:val="00B050"/>
+          <w:sz w:val="22"/>
+        </w:rPr>
+        <w:t>Verifique-se se é necessário trasladar para o processo correto, fazendo-o se necessário. Quanto a este, para que se evite tumulto posterior, desentranhe-se os documentos de IDs 269424769 e 269424778.</w:t>
+      </w:r>
+    </w:p>
+    <w:p>
+      <w:pPr>
+        <w:spacing w:line="360" w:lineRule="auto" w:after="0"/>
+        <w:ind w:firstLine="2268"/>
+      </w:pPr>
+      <w:r>
+        <w:rPr>
+          <w:sz w:val="28"/>
+        </w:rPr>
+      </w:r>
+    </w:p>
+    <w:p>
+      <w:pPr>
+        <w:spacing w:line="360" w:lineRule="auto" w:after="0" w:before="0"/>
+        <w:jc w:val="both"/>
+      </w:pPr>
+      <w:r>
+        <w:rPr>
+          <w:rFonts w:ascii="Arial" w:hAnsi="Arial" w:cs="Arial"/>
+          <w:b w:val="0"/>
+          <w:i w:val="0"/>
+          <w:color w:val="00B050"/>
+          <w:sz w:val="22"/>
+        </w:rPr>
+        <w:t>Retornem o processo ao arquivo provisório, até 01/06/2031, a fim de que se aguarde o transcurso do prazo prescricional, facultando-se o desarquivamento para prosseguimento do cumprimento de sentença a qualquer tempo, se forem encontrados bens penhoráveis. Não haverá mais interrupção do prazo, tendo em conta a pesquisa frutífera de ID 270463690, que causou a interrupção do prazo prescricional, voltando a correr com a pesquisa infrutífera de ID 278142028.</w:t>
+      </w:r>
+    </w:p>
+    <w:p>
+      <w:pPr>
+        <w:spacing w:line="360" w:lineRule="auto" w:after="0"/>
+        <w:ind w:firstLine="2268"/>
+      </w:pPr>
+      <w:r>
+        <w:rPr>
+          <w:sz w:val="28"/>
+        </w:rPr>
+      </w:r>
+    </w:p>
+    <w:p>
+      <w:pPr>
+        <w:spacing w:line="360" w:lineRule="auto" w:after="0" w:before="0"/>
+        <w:jc w:val="center"/>
+      </w:pPr>
+      <w:r>
+        <w:rPr>
+          <w:rFonts w:ascii="Arial" w:hAnsi="Arial" w:cs="Arial"/>
+          <w:b/>
+          <w:i w:val="0"/>
+          <w:color w:val="00B050"/>
+          <w:sz w:val="22"/>
+        </w:rPr>
+        <w:t>BRASÍLIA, DF, 19 de junho de 2026 08:32:00.</w:t>
+      </w:r>
+    </w:p>
+    <w:p>
+      <w:pPr>
+        <w:spacing w:line="360" w:lineRule="auto" w:after="0"/>
+        <w:ind w:firstLine="2268"/>
+      </w:pPr>
+      <w:r>
+        <w:rPr>
+          <w:sz w:val="28"/>
+        </w:rPr>
+      </w:r>
+    </w:p>
+    <w:p>
+      <w:pPr>
+        <w:spacing w:line="360" w:lineRule="auto" w:after="0" w:before="0"/>
+        <w:jc w:val="center"/>
+      </w:pPr>
+      <w:r>
+        <w:rPr>
+          <w:rFonts w:ascii="Arial" w:hAnsi="Arial" w:cs="Arial"/>
+          <w:b/>
+          <w:i w:val="0"/>
+          <w:color w:val="00B050"/>
+          <w:sz w:val="22"/>
+        </w:rPr>
+        <w:t>LEANDRO BORGES DE FIGUEIREDO</w:t>
+      </w:r>
+    </w:p>
+    <w:p>
+      <w:pPr>
+        <w:spacing w:line="360" w:lineRule="auto" w:after="0"/>
+        <w:ind w:firstLine="2268"/>
+      </w:pPr>
+      <w:r>
+        <w:rPr>
+          <w:sz w:val="28"/>
+        </w:rPr>
+      </w:r>
+    </w:p>
+    <w:p>
+      <w:pPr>
+        <w:spacing w:line="360" w:lineRule="auto" w:after="0" w:before="0"/>
+        <w:jc w:val="center"/>
+      </w:pPr>
+      <w:r>
+        <w:rPr>
+          <w:rFonts w:ascii="Arial" w:hAnsi="Arial" w:cs="Arial"/>
+          <w:b/>
+          <w:i w:val="0"/>
+          <w:color w:val="00B050"/>
+          <w:sz w:val="22"/>
+        </w:rPr>
+        <w:t>Juiz de Direito</w:t>
+      </w:r>
+    </w:p>
+    <w:p>
+      <w:pPr>
+        <w:spacing w:line="360" w:lineRule="auto" w:after="0"/>
+        <w:ind w:firstLine="2268"/>
+      </w:pPr>
+      <w:r>
+        <w:rPr>
+          <w:sz w:val="28"/>
+        </w:rPr>
+      </w:r>
+    </w:p>
+    <w:p>
+      <w:pPr>
         <w:keepNext/>
         <w:spacing w:line="360" w:lineRule="auto" w:after="0" w:before="0"/>
         <w:jc w:val="center"/>
       </w:pPr>
-      <w:commentRangeStart w:id="9"/>
+      <w:commentRangeStart w:id="10"/>
       <w:r>
         <w:rPr>
           <w:rFonts w:ascii="Arial" w:hAnsi="Arial" w:cs="Arial"/>
@@ -2611,12 +3028,12 @@
         </w:rPr>
         <w:t>PRECEDENTES CONTRÁRIOS AO VOTO</w:t>
       </w:r>
-      <w:commentRangeEnd w:id="9"/>
+      <w:commentRangeEnd w:id="10"/>
       <w:r>
         <w:rPr>
           <w:rStyle w:val="CommentReference"/>
         </w:rPr>
-        <w:commentReference w:id="9"/>
+        <w:commentReference w:id="10"/>
       </w:r>
     </w:p>
     <w:p>
@@ -2722,7 +3139,7 @@
 
 <file path=word/comments.xml><?xml version="1.0" encoding="utf-8"?>
 <w:comments xmlns:wpc="http://schemas.microsoft.com/office/word/2010/wordprocessingCanvas" xmlns:cx="http://schemas.microsoft.com/office/drawing/2014/chartex" xmlns:cx1="http://schemas.microsoft.com/office/drawing/2015/9/8/chartex" xmlns:cx2="http://schemas.microsoft.com/office/drawing/2015/10/21/chartex" xmlns:cx3="http://schemas.microsoft.com/office/drawing/2016/5/9/chartex" xmlns:cx4="http://schemas.microsoft.com/office/drawing/2016/5/10/chartex" xmlns:cx5="http://schemas.microsoft.com/office/drawing/2016/5/11/chartex" xmlns:cx6="http://schemas.microsoft.com/office/drawing/2016/5/12/chartex" xmlns:cx7="http://schemas.microsoft.com/office/drawing/2016/5/13/chartex" xmlns:cx8="http://schemas.microsoft.com/office/drawing/2016/5/14/chartex" xmlns:mc="http://schemas.openxmlformats.org/markup-compatibility/2006" xmlns:aink="http://schemas.microsoft.com/office/drawing/2016/ink" xmlns:am3d="http://schemas.microsoft.com/office/drawing/2017/model3d" xmlns:o="urn:schemas-microsoft-com:office:office" xmlns:oel="http://schemas.microsoft.com/office/2019/extlst" xmlns:r="http://schemas.openxmlformats.org/officeDocument/2006/relationships" xmlns:m="http://schemas.openxmlformats.org/officeDocument/2006/math" xmlns:v="urn:schemas-microsoft-com:vml" xmlns:wp14="http://schemas.microsoft.com/office/word/2010/wordprocessingDrawing" xmlns:wp="http://schemas.openxmlformats.org/drawingml/2006/wordprocessingDrawing" xmlns:w10="urn:schemas-microsoft-com:office:word" xmlns:w="http://schemas.openxmlformats.org/wordprocessingml/2006/main" xmlns:w14="http://schemas.microsoft.com/office/word/2010/wordml" xmlns:w15="http://schemas.microsoft.com/office/word/2012/wordml" xmlns:w16cex="http://schemas.microsoft.com/office/word/2018/wordml/cex" xmlns:w16cid="http://schemas.microsoft.com/office/word/2016/wordml/cid" xmlns:w16="http://schemas.microsoft.com/office/word/2018/wordml" xmlns:w16du="http://schemas.microsoft.com/office/word/2023/wordml/word16du" xmlns:w16sdtdh="http://schemas.microsoft.com/office/word/2020/wordml/sdtdatahash" xmlns:w16sdtfl="http://schemas.microsoft.com/office/word/2024/wordml/sdtformatlock" xmlns:w16se="http://schemas.microsoft.com/office/word/2015/wordml/symex" xmlns:wpg="http://schemas.microsoft.com/office/word/2010/wordprocessingGroup" xmlns:wpi="http://schemas.microsoft.com/office/word/2010/wordprocessingInk" xmlns:wne="http://schemas.microsoft.com/office/word/2006/wordml" xmlns:wps="http://schemas.microsoft.com/office/word/2010/wordprocessingShape" mc:Ignorable="w14 w15 w16se w16cid w16 w16cex w16sdtdh w16sdtfl w16du wp14">
-  <w:comment w:id="0" w:author="Assessor GDSXSR" w:initials="AG" w:date="2026-10-29T18:33:28Z">
+  <w:comment w:id="0" w:author="Assessor GDSXSR" w:initials="AG" w:date="2026-10-30T20:45:47Z">
     <w:p>
       <w:pPr>
         <w:pStyle w:val="CommentText"/>
@@ -2738,7 +3155,7 @@
       </w:r>
     </w:p>
   </w:comment>
-  <w:comment w:id="1" w:author="Assessor GDSXSR" w:initials="AG" w:date="2026-10-29T18:33:28Z">
+  <w:comment w:id="1" w:author="Assessor GDSXSR" w:initials="AG" w:date="2026-10-30T20:45:47Z">
     <w:p>
       <w:pPr>
         <w:pStyle w:val="CommentText"/>
@@ -2750,11 +3167,11 @@
         <w:annotationRef/>
       </w:r>
       <w:r>
-        <w:t>MINUTA GDSXSR — Resumo da decisão agravada (C-39), em vermelho. Feito com o que o relatório da liminar (ID 86923009) registra sobre a decisão de origem (ID 278321327); ajustar quando a decisão for anexada.</w:t>
+        <w:t>MINUTA GDSXSR — Resumo da decisão agravada (C-39), em vermelho, feito com a decisão integral (ID 278321327, do processo de origem, 19/06/2026), que consta ao final em verde.</w:t>
       </w:r>
     </w:p>
   </w:comment>
-  <w:comment w:id="2" w:author="Assessor GDSXSR" w:initials="AG" w:date="2026-10-29T18:33:28Z">
+  <w:comment w:id="2" w:author="Assessor GDSXSR" w:initials="AG" w:date="2026-10-30T20:45:47Z">
     <w:p>
       <w:pPr>
         <w:pStyle w:val="CommentText"/>
@@ -2770,7 +3187,7 @@
       </w:r>
     </w:p>
   </w:comment>
-  <w:comment w:id="3" w:author="Assessor GDSXSR" w:initials="AG" w:date="2026-10-29T18:33:28Z">
+  <w:comment w:id="3" w:author="Assessor GDSXSR" w:initials="AG" w:date="2026-10-30T20:45:47Z">
     <w:p>
       <w:pPr>
         <w:pStyle w:val="CommentText"/>
@@ -2782,11 +3199,11 @@
         <w:annotationRef/>
       </w:r>
       <w:r>
-        <w:t>MINUTA GDSXSR — C-3T: admissibilidade direta. Preparo recolhido (certidão ID 86825152). Tempestividade não conferida: a data de publicação da decisão agravada não está nos autos recebidos (C-52).</w:t>
+        <w:t>MINUTA GDSXSR — C-3T: admissibilidade direta. Preparo recolhido (certidão ID 86825152). Tempestividade: decisão disponibilizada no DJEN em 22/06/2026 e publicada em 23/06/2026; agravo protocolado em 15/07/2026. Tempestivo se o termo foi deslocado pela Portaria Conjunta 48/2026 (e 53/2026); conferir no site do TJDFT (C-52, C-24).</w:t>
       </w:r>
     </w:p>
   </w:comment>
-  <w:comment w:id="4" w:author="Assessor GDSXSR" w:initials="AG" w:date="2026-10-29T18:33:28Z">
+  <w:comment w:id="4" w:author="Assessor GDSXSR" w:initials="AG" w:date="2026-10-30T20:45:47Z">
     <w:p>
       <w:pPr>
         <w:pStyle w:val="CommentText"/>
@@ -2802,7 +3219,7 @@
       </w:r>
     </w:p>
   </w:comment>
-  <w:comment w:id="5" w:author="Assessor GDSXSR" w:initials="AG" w:date="2026-10-29T18:33:28Z">
+  <w:comment w:id="5" w:author="Assessor GDSXSR" w:initials="AG" w:date="2026-10-30T20:45:47Z">
     <w:p>
       <w:pPr>
         <w:pStyle w:val="CommentText"/>
@@ -2818,7 +3235,7 @@
       </w:r>
     </w:p>
   </w:comment>
-  <w:comment w:id="6" w:author="Assessor GDSXSR" w:initials="AG" w:date="2026-10-29T18:33:28Z">
+  <w:comment w:id="6" w:author="Assessor GDSXSR" w:initials="AG" w:date="2026-10-30T20:45:47Z">
     <w:p>
       <w:pPr>
         <w:pStyle w:val="CommentText"/>
@@ -2830,11 +3247,27 @@
         <w:annotationRef/>
       </w:r>
       <w:r>
+        <w:t>MINUTA GDSXSR — C-67: acórdão da Turma que responde ao fundamento da decisão agravada (emolumentos e ausência de hipossuficiência). Item 6 da ementa transcrito do iajus. Número do acórdão e DJe a completar no JurisDF. Fato posterior: a pesquisa no SERP-JUD foi realizada na origem em 28/08/2026 (ID 288777231 e ID 288777233, do processo de origem); o resultado é imagem e não foi lido. O agravo não fica prejudicado, porque a liminar é provisória e o provimento confirma a medida.</w:t>
+      </w:r>
+    </w:p>
+  </w:comment>
+  <w:comment w:id="7" w:author="Assessor GDSXSR" w:initials="AG" w:date="2026-10-30T20:45:47Z">
+    <w:p>
+      <w:pPr>
+        <w:pStyle w:val="CommentText"/>
+      </w:pPr>
+      <w:r>
+        <w:rPr>
+          <w:rStyle w:val="CommentReference"/>
+        </w:rPr>
+        <w:annotationRef/>
+      </w:r>
+      <w:r>
         <w:t>MINUTA GDSXSR — C-53 (divergência interna). Resultado mantido (DP, confirmando a liminar do Relator). Pesquisa no iajus (SERP-JUD, 4ª TCiv, 2025-2026): a favor, AGI 0726908-13 (Des. Sérgio Rocha, 22/01/2026), 0728956-42 (Des. Sérgio Rocha, 27/11/2025, parcial), 0724293-50 (Des. Sérgio Rocha, 02/10/2025), 0720382-30 (Des. Sérgio Rocha, 07/08/2025), 0744294-56 (Des. Aiston Henrique de Sousa, 22/01/2026), 0717054-92 (Des. Aiston, 31/07/2025) e 0706941-79 (Des. Aiston, 11/06/2025); contra (decisão agravada mantida porque o credor pode usar o SREI/pagar emolumentos), AGI 0746612-12 (Des. Aiston, 12/02/2026), 0728011-55 (Des. Jansen Fialho de Almeida, 25/09/2025) e 0711684-35 (Des. Jansen, 11/06/2025). A decisão agravada tem o mesmo fundamento dos acórdãos contrários; por isso o voto acrescenta o REsp 2.226.101/SC, que dispensa o esgotamento de diligências extrajudiciais, e leva os dois mais recentes ao bloco violeta final. Voto conforme entendimento anterior do Relator (C-67), AGI 0726908-13.2025.8.07.0000, Des. Sérgio Rocha, 4ª Turma Cível, 22/01/2026 (número do acórdão e DJe a completar no JurisDF): “AGRAVO DE INSTRUMENTO. DIREITO PROCESSUAL CIVIL. EXECUÇÃO DE TÍTULO EXTRAJUDICIAL. CONSULTA AO SISTEMA SERP-JUD. POSSIBILIDADE DE UTILIZAÇÃO INDEPENDENTE DA GRATUIDADE DE JUSTIÇA. EFETIVIDADE DA EXECUÇÃO. PROVIMENTO. I. Caso em exame 1. Agravo de instrumento interposto contra decisão que, em execução de título extrajudicial (contrato de locação de quiosque – R$ 20.048,91), indeferiu pedido de consulta ao sistema SERP-JUD, sob o fundamento de ausência de gratuidade de justiça e limitação de acesso à ferramenta. II. Questão em discussão 2. A questão em discussão consiste em verificar se é possível autorizar consulta ao sistema SERP-JUD para localização de bens penhoráveis, mesmo sem concessão de gratuidade de justiça, diante da alegação de esgotamento de diligências anteriores e necessidade de efetividade da execução. III. Razões de decidir 3. O sistema SERP-JUD, instituído pela Lei nº 14.382/2022 e regulamentado pelo Provimento CNJ nº 139/2023 e pela Resolução CNJ nº 584/2024, integra a lista oficial de sistemas destinados à pesquisa de dados e localização de bens para constrição patrimonial, conforme Portaria CNJ nº 393/2024. 4. A jurisprudência do TJDFT admite expressamente a utilização do SERP-JUD como meio idôneo e eficaz para localização de bens do devedor, por permitir consulta unificada a registros civis, imobiliários e de títulos e documentos em todo o território nacional. IV. Dispositivo 5. Deu-se provimento ao apelo do exequente para autorizar a consulta ao sistema SERP-JUD.” (fonte: iajus, ementa)</w:t>
       </w:r>
     </w:p>
   </w:comment>
-  <w:comment w:id="7" w:author="Assessor GDSXSR" w:initials="AG" w:date="2026-10-29T18:33:28Z">
+  <w:comment w:id="8" w:author="Assessor GDSXSR" w:initials="AG" w:date="2026-10-30T20:45:47Z">
     <w:p>
       <w:pPr>
         <w:pStyle w:val="CommentText"/>
@@ -2850,7 +3283,7 @@
       </w:r>
     </w:p>
   </w:comment>
-  <w:comment w:id="8" w:author="Assessor GDSXSR" w:initials="AG" w:date="2026-10-29T18:33:28Z">
+  <w:comment w:id="9" w:author="Assessor GDSXSR" w:initials="AG" w:date="2026-10-30T20:45:47Z">
     <w:p>
       <w:pPr>
         <w:pStyle w:val="CommentText"/>
@@ -2862,11 +3295,11 @@
         <w:annotationRef/>
       </w:r>
       <w:r>
-        <w:t>MINUTA GDSXSR — PENDÊNCIA (C-45, C-52): colar aqui o texto integral da decisão agravada (ID 278321327, do processo de origem), em verde. Não veio nos autos recebidos.</w:t>
+        <w:t>MINUTA GDSXSR — C-45: texto integral da decisão agravada (ID 278321327, do processo de origem, assinada em 19/06/2026), copiado dos autos de origem, em verde, sem alteração.</w:t>
       </w:r>
     </w:p>
   </w:comment>
-  <w:comment w:id="9" w:author="Assessor GDSXSR" w:initials="AG" w:date="2026-10-29T18:33:28Z">
+  <w:comment w:id="10" w:author="Assessor GDSXSR" w:initials="AG" w:date="2026-10-30T20:45:47Z">
     <w:p>
       <w:pPr>
         <w:pStyle w:val="CommentText"/>

</xml_diff>